<commit_message>
Added new features and updated documentation for the project. The changes include modifications to the database schema, updates to the docker-compose configuration, and enhancements to various documentation files related to backend and frontend development.
</commit_message>
<xml_diff>
--- a/docs/1_Backend_Dev1_Core_API.docx
+++ b/docs/1_Backend_Dev1_Core_API.docx
@@ -29,7 +29,7 @@
           <w:sz w:val="22"/>
           <w:szCs w:val="22"/>
         </w:rPr>
-        <w:t xml:space="preserve">OPay SwiftOrder · Engineering Brief</w:t>
+        <w:t xml:space="preserve">ChatRail · Engineering Brief</w:t>
       </w:r>
     </w:p>
     <w:p>
@@ -46,7 +46,7 @@
         <w:spacing w:after="120"/>
       </w:pPr>
       <w:r>
-        <w:t xml:space="preserve">OPay SwiftOrder turns unstructured WhatsApp/Instagram chats and voice notes into structured, verified, trackable orders — Gemini extracts the order, the seller approves it, OPay verifies the payment via webhook (no screenshot fraud), and the customer gets live status updates in the same chat.</w:t>
+        <w:t xml:space="preserve">ChatRail turns unstructured WhatsApp/Instagram chats and voice notes into structured, verified, trackable orders — Gemini extracts the order, the seller approves it, OPay verifies the payment via webhook (no screenshot fraud), and the customer gets live status updates in the same chat.</w:t>
       </w:r>
     </w:p>
     <w:p>

</xml_diff>